<commit_message>
Re-added leading 'the' before recipient name
</commit_message>
<xml_diff>
--- a/templates/MDL_Template_Data_Mapping_Comments.docx
+++ b/templates/MDL_Template_Data_Mapping_Comments.docx
@@ -750,52 +750,14 @@
           <w:sz w:val="24"/>
           <w:szCs w:val="24"/>
         </w:rPr>
-        <w:t xml:space="preserve">for </w:t>
-      </w:r>
-      <w:commentRangeStart w:id="16"/>
-      <w:r>
-        <w:rPr>
-          <w:sz w:val="24"/>
-          <w:szCs w:val="24"/>
-        </w:rPr>
-        <w:t>[</w:t>
-      </w:r>
-      <w:r>
-        <w:rPr>
-          <w:sz w:val="24"/>
-          <w:szCs w:val="24"/>
-          <w:highlight w:val="yellow"/>
-        </w:rPr>
-        <w:t>T</w:t>
-      </w:r>
-      <w:r>
-        <w:rPr>
-          <w:sz w:val="24"/>
-          <w:szCs w:val="24"/>
-          <w:highlight w:val="yellow"/>
-        </w:rPr>
-        <w:t>he</w:t>
-      </w:r>
-      <w:r>
-        <w:rPr>
-          <w:sz w:val="24"/>
-          <w:szCs w:val="24"/>
-        </w:rPr>
-        <w:t>]</w:t>
-      </w:r>
-      <w:r>
-        <w:rPr>
-          <w:sz w:val="24"/>
-          <w:szCs w:val="24"/>
-        </w:rPr>
-        <w:t xml:space="preserve"> </w:t>
-      </w:r>
-      <w:commentRangeEnd w:id="16"/>
-      <w:r>
-        <w:rPr>
-          <w:rStyle w:val="CommentReference"/>
-        </w:rPr>
-        <w:commentReference w:id="16"/>
+        <w:t>for</w:t>
+      </w:r>
+      <w:r>
+        <w:rPr>
+          <w:sz w:val="24"/>
+          <w:szCs w:val="24"/>
+        </w:rPr>
+        <w:t xml:space="preserve"> the</w:t>
       </w:r>
       <w:r>
         <w:rPr>
@@ -804,27 +766,27 @@
           <w:sz w:val="24"/>
           <w:szCs w:val="24"/>
         </w:rPr>
-        <w:t>[</w:t>
-      </w:r>
-      <w:commentRangeStart w:id="17"/>
+        <w:t xml:space="preserve"> </w:t>
+      </w:r>
       <w:r>
         <w:rPr>
           <w:b/>
           <w:bCs/>
           <w:sz w:val="24"/>
           <w:szCs w:val="24"/>
-          <w:highlight w:val="yellow"/>
-        </w:rPr>
-        <w:t>Recipient Name</w:t>
-      </w:r>
+        </w:rPr>
+        <w:t>[</w:t>
+      </w:r>
+      <w:commentRangeStart w:id="16"/>
       <w:r>
         <w:rPr>
           <w:b/>
           <w:bCs/>
           <w:sz w:val="24"/>
           <w:szCs w:val="24"/>
-        </w:rPr>
-        <w:t>]</w:t>
+          <w:highlight w:val="yellow"/>
+        </w:rPr>
+        <w:t>Recipient Name</w:t>
       </w:r>
       <w:r>
         <w:rPr>
@@ -833,14 +795,23 @@
           <w:sz w:val="24"/>
           <w:szCs w:val="24"/>
         </w:rPr>
-        <w:t xml:space="preserve"> </w:t>
-      </w:r>
-      <w:commentRangeEnd w:id="17"/>
+        <w:t>]</w:t>
+      </w:r>
+      <w:r>
+        <w:rPr>
+          <w:b/>
+          <w:bCs/>
+          <w:sz w:val="24"/>
+          <w:szCs w:val="24"/>
+        </w:rPr>
+        <w:t xml:space="preserve"> </w:t>
+      </w:r>
+      <w:commentRangeEnd w:id="16"/>
       <w:r>
         <w:rPr>
           <w:rStyle w:val="CommentReference"/>
         </w:rPr>
-        <w:commentReference w:id="17"/>
+        <w:commentReference w:id="16"/>
       </w:r>
       <w:r>
         <w:rPr>
@@ -1029,13 +1000,29 @@
         </w:rPr>
         <w:t xml:space="preserve"> </w:t>
       </w:r>
-      <w:bookmarkStart w:id="18" w:name="_Hlk154663119"/>
-      <w:r>
-        <w:rPr>
-          <w:sz w:val="24"/>
-          <w:szCs w:val="24"/>
-        </w:rPr>
-        <w:t xml:space="preserve">No questioned costs </w:t>
+      <w:bookmarkStart w:id="17" w:name="_Hlk154663119"/>
+      <w:r>
+        <w:rPr>
+          <w:sz w:val="24"/>
+          <w:szCs w:val="24"/>
+        </w:rPr>
+        <w:t xml:space="preserve">No </w:t>
+      </w:r>
+      <w:proofErr w:type="gramStart"/>
+      <w:r>
+        <w:rPr>
+          <w:sz w:val="24"/>
+          <w:szCs w:val="24"/>
+        </w:rPr>
+        <w:t>questioned</w:t>
+      </w:r>
+      <w:proofErr w:type="gramEnd"/>
+      <w:r>
+        <w:rPr>
+          <w:sz w:val="24"/>
+          <w:szCs w:val="24"/>
+        </w:rPr>
+        <w:t xml:space="preserve"> costs </w:t>
       </w:r>
       <w:r>
         <w:rPr>
@@ -1058,8 +1045,8 @@
         </w:rPr>
         <w:t>Treasury has made the following determinations regarding the audit finding</w:t>
       </w:r>
+      <w:commentRangeStart w:id="18"/>
       <w:commentRangeStart w:id="19"/>
-      <w:commentRangeStart w:id="20"/>
       <w:r>
         <w:rPr>
           <w:sz w:val="24"/>
@@ -1118,6 +1105,13 @@
         </w:rPr>
         <w:t xml:space="preserve"> </w:t>
       </w:r>
+      <w:commentRangeEnd w:id="18"/>
+      <w:r>
+        <w:rPr>
+          <w:rStyle w:val="CommentReference"/>
+        </w:rPr>
+        <w:commentReference w:id="18"/>
+      </w:r>
       <w:commentRangeEnd w:id="19"/>
       <w:r>
         <w:rPr>
@@ -1125,13 +1119,6 @@
         </w:rPr>
         <w:commentReference w:id="19"/>
       </w:r>
-      <w:commentRangeEnd w:id="20"/>
-      <w:r>
-        <w:rPr>
-          <w:rStyle w:val="CommentReference"/>
-        </w:rPr>
-        <w:commentReference w:id="20"/>
-      </w:r>
       <w:r>
         <w:rPr>
           <w:sz w:val="24"/>
@@ -1139,7 +1126,7 @@
         </w:rPr>
         <w:t>listed below:</w:t>
       </w:r>
-      <w:bookmarkEnd w:id="18"/>
+      <w:bookmarkEnd w:id="17"/>
     </w:p>
     <w:p>
       <w:pPr>
@@ -1162,9 +1149,9 @@
           <w:szCs w:val="24"/>
         </w:rPr>
       </w:pPr>
+      <w:commentRangeStart w:id="20"/>
       <w:commentRangeStart w:id="21"/>
       <w:commentRangeStart w:id="22"/>
-      <w:commentRangeStart w:id="23"/>
       <w:r>
         <w:rPr>
           <w:b/>
@@ -1233,6 +1220,13 @@
         </w:rPr>
         <w:t xml:space="preserve"> </w:t>
       </w:r>
+      <w:commentRangeEnd w:id="20"/>
+      <w:r>
+        <w:rPr>
+          <w:rStyle w:val="CommentReference"/>
+        </w:rPr>
+        <w:commentReference w:id="20"/>
+      </w:r>
       <w:commentRangeEnd w:id="21"/>
       <w:r>
         <w:rPr>
@@ -1246,13 +1240,6 @@
           <w:rStyle w:val="CommentReference"/>
         </w:rPr>
         <w:commentReference w:id="22"/>
-      </w:r>
-      <w:commentRangeEnd w:id="23"/>
-      <w:r>
-        <w:rPr>
-          <w:rStyle w:val="CommentReference"/>
-        </w:rPr>
-        <w:commentReference w:id="23"/>
       </w:r>
     </w:p>
     <w:p>
@@ -1282,7 +1269,7 @@
           <w:szCs w:val="24"/>
         </w:rPr>
       </w:pPr>
-      <w:bookmarkStart w:id="24" w:name="_Hlk154663631"/>
+      <w:bookmarkStart w:id="23" w:name="_Hlk154663631"/>
     </w:p>
     <w:p>
       <w:pPr>
@@ -1294,7 +1281,7 @@
           <w:szCs w:val="24"/>
         </w:rPr>
       </w:pPr>
-      <w:commentRangeStart w:id="25"/>
+      <w:commentRangeStart w:id="24"/>
       <w:r>
         <w:rPr>
           <w:sz w:val="24"/>
@@ -1671,16 +1658,16 @@
         </w:rPr>
         <w:t xml:space="preserve"> indicated in the single audit report.    </w:t>
       </w:r>
-      <w:bookmarkStart w:id="26" w:name="_Hlk172811021"/>
-      <w:r>
-        <w:rPr>
-          <w:sz w:val="24"/>
-          <w:szCs w:val="24"/>
-        </w:rPr>
-        <w:t xml:space="preserve"> </w:t>
-      </w:r>
-    </w:p>
-    <w:bookmarkEnd w:id="26"/>
+      <w:bookmarkStart w:id="25" w:name="_Hlk172811021"/>
+      <w:r>
+        <w:rPr>
+          <w:sz w:val="24"/>
+          <w:szCs w:val="24"/>
+        </w:rPr>
+        <w:t xml:space="preserve"> </w:t>
+      </w:r>
+    </w:p>
+    <w:bookmarkEnd w:id="25"/>
     <w:p>
       <w:pPr>
         <w:pStyle w:val="BodyText"/>
@@ -1926,6 +1913,7 @@
         </w:rPr>
         <w:t xml:space="preserve"> </w:t>
       </w:r>
+      <w:proofErr w:type="gramStart"/>
       <w:r>
         <w:rPr>
           <w:sz w:val="24"/>
@@ -1933,6 +1921,7 @@
         </w:rPr>
         <w:t>appear</w:t>
       </w:r>
+      <w:proofErr w:type="gramEnd"/>
       <w:r>
         <w:rPr>
           <w:sz w:val="24"/>
@@ -2155,14 +2144,14 @@
         </w:rPr>
         <w:t xml:space="preserve"> </w:t>
       </w:r>
-      <w:bookmarkStart w:id="27" w:name="_Hlk154663714"/>
-      <w:bookmarkEnd w:id="24"/>
-      <w:commentRangeEnd w:id="25"/>
+      <w:bookmarkStart w:id="26" w:name="_Hlk154663714"/>
+      <w:bookmarkEnd w:id="23"/>
+      <w:commentRangeEnd w:id="24"/>
       <w:r>
         <w:rPr>
           <w:rStyle w:val="CommentReference"/>
         </w:rPr>
-        <w:commentReference w:id="25"/>
+        <w:commentReference w:id="24"/>
       </w:r>
     </w:p>
     <w:p>
@@ -2190,9 +2179,16 @@
           <w:sz w:val="24"/>
           <w:szCs w:val="24"/>
         </w:rPr>
+        <w:t xml:space="preserve">The </w:t>
+      </w:r>
+      <w:r>
+        <w:rPr>
+          <w:sz w:val="24"/>
+          <w:szCs w:val="24"/>
+        </w:rPr>
         <w:t>[</w:t>
       </w:r>
-      <w:commentRangeStart w:id="28"/>
+      <w:commentRangeStart w:id="27"/>
       <w:r>
         <w:rPr>
           <w:sz w:val="24"/>
@@ -2215,19 +2211,35 @@
         </w:rPr>
         <w:t xml:space="preserve"> </w:t>
       </w:r>
-      <w:commentRangeEnd w:id="28"/>
+      <w:commentRangeEnd w:id="27"/>
       <w:r>
         <w:rPr>
           <w:rStyle w:val="CommentReference"/>
         </w:rPr>
-        <w:commentReference w:id="28"/>
-      </w:r>
-      <w:r>
-        <w:rPr>
-          <w:sz w:val="24"/>
-          <w:szCs w:val="24"/>
-        </w:rPr>
-        <w:t>may appeal Treasury’s decision for the audit finding</w:t>
+        <w:commentReference w:id="27"/>
+      </w:r>
+      <w:r>
+        <w:rPr>
+          <w:sz w:val="24"/>
+          <w:szCs w:val="24"/>
+        </w:rPr>
+        <w:t xml:space="preserve">may </w:t>
+      </w:r>
+      <w:proofErr w:type="gramStart"/>
+      <w:r>
+        <w:rPr>
+          <w:sz w:val="24"/>
+          <w:szCs w:val="24"/>
+        </w:rPr>
+        <w:t>appeal</w:t>
+      </w:r>
+      <w:proofErr w:type="gramEnd"/>
+      <w:r>
+        <w:rPr>
+          <w:sz w:val="24"/>
+          <w:szCs w:val="24"/>
+        </w:rPr>
+        <w:t xml:space="preserve"> Treasury’s decision for the audit finding</w:t>
       </w:r>
       <w:r>
         <w:rPr>
@@ -2305,6 +2317,7 @@
         <w:t>treasury_contact_email</w:t>
       </w:r>
       <w:proofErr w:type="spellEnd"/>
+      <w:proofErr w:type="gramStart"/>
       <w:r>
         <w:rPr>
           <w:sz w:val="24"/>
@@ -2312,6 +2325,7 @@
         </w:rPr>
         <w:t>] .</w:t>
       </w:r>
+      <w:proofErr w:type="gramEnd"/>
       <w:r>
         <w:rPr>
           <w:sz w:val="24"/>
@@ -2529,7 +2543,7 @@
           <w:szCs w:val="24"/>
         </w:rPr>
       </w:pPr>
-      <w:bookmarkStart w:id="29" w:name="_Hlk172811103"/>
+      <w:bookmarkStart w:id="28" w:name="_Hlk172811103"/>
     </w:p>
     <w:p>
       <w:pPr>
@@ -2623,6 +2637,7 @@
         </w:rPr>
         <w:t xml:space="preserve"> </w:t>
       </w:r>
+      <w:proofErr w:type="gramStart"/>
       <w:r>
         <w:rPr>
           <w:sz w:val="24"/>
@@ -2652,6 +2667,7 @@
         </w:rPr>
         <w:t>)</w:t>
       </w:r>
+      <w:proofErr w:type="gramEnd"/>
       <w:r>
         <w:rPr>
           <w:sz w:val="24"/>
@@ -2735,12 +2751,21 @@
         <w:t>treasury_contact_email</w:t>
       </w:r>
       <w:proofErr w:type="spellEnd"/>
-      <w:r>
-        <w:rPr>
-          <w:sz w:val="24"/>
-          <w:szCs w:val="24"/>
-        </w:rPr>
-        <w:t xml:space="preserve">] . </w:t>
+      <w:proofErr w:type="gramStart"/>
+      <w:r>
+        <w:rPr>
+          <w:sz w:val="24"/>
+          <w:szCs w:val="24"/>
+        </w:rPr>
+        <w:t>] .</w:t>
+      </w:r>
+      <w:proofErr w:type="gramEnd"/>
+      <w:r>
+        <w:rPr>
+          <w:sz w:val="24"/>
+          <w:szCs w:val="24"/>
+        </w:rPr>
+        <w:t xml:space="preserve"> </w:t>
       </w:r>
       <w:r>
         <w:rPr>
@@ -2758,7 +2783,7 @@
         <w:t>you.</w:t>
       </w:r>
     </w:p>
-    <w:bookmarkEnd w:id="29"/>
+    <w:bookmarkEnd w:id="28"/>
     <w:p>
       <w:pPr>
         <w:pStyle w:val="BodyText"/>
@@ -2980,7 +3005,7 @@
         <w:t xml:space="preserve">Treasury </w:t>
       </w:r>
     </w:p>
-    <w:bookmarkEnd w:id="27"/>
+    <w:bookmarkEnd w:id="26"/>
     <w:p>
       <w:pPr>
         <w:pStyle w:val="BodyText"/>
@@ -3266,7 +3291,7 @@
       </w:r>
     </w:p>
   </w:comment>
-  <w:comment w:id="16" w:author="Anthony D'Alessandro" w:date="2025-09-08T11:19:00Z" w:initials="AD">
+  <w:comment w:id="16" w:author="Anthony D'Alessandro" w:date="2025-09-08T11:20:00Z" w:initials="AD">
     <w:p>
       <w:pPr>
         <w:pStyle w:val="CommentText"/>
@@ -3278,11 +3303,17 @@
         <w:annotationRef/>
       </w:r>
       <w:r>
-        <w:t>Must add “The” before recipient name</w:t>
+        <w:t>Need full name as written in SF-SAC [auditee_name] “</w:t>
+      </w:r>
+      <w:r>
+        <w:rPr>
+          <w:color w:val="000000"/>
+        </w:rPr>
+        <w:t>CITY OF ANN ARBOR, MICHIGAN”</w:t>
       </w:r>
     </w:p>
   </w:comment>
-  <w:comment w:id="17" w:author="Anthony D'Alessandro" w:date="2025-09-08T11:20:00Z" w:initials="AD">
+  <w:comment w:id="18" w:author="Anthony D'Alessandro" w:date="2025-09-08T11:30:00Z" w:initials="AD">
     <w:p>
       <w:pPr>
         <w:pStyle w:val="CommentText"/>
@@ -3294,17 +3325,11 @@
         <w:annotationRef/>
       </w:r>
       <w:r>
-        <w:t>Need full name as written in SF-SAC [auditee_name] “</w:t>
-      </w:r>
-      <w:r>
-        <w:rPr>
-          <w:color w:val="000000"/>
-        </w:rPr>
-        <w:t>CITY OF ANN ARBOR, MICHIGAN”</w:t>
+        <w:t>Add S if plural, remove if singular finding</w:t>
       </w:r>
     </w:p>
   </w:comment>
-  <w:comment w:id="19" w:author="Anthony D'Alessandro" w:date="2025-09-08T11:30:00Z" w:initials="AD">
+  <w:comment w:id="19" w:author="Anthony D'Alessandro" w:date="2025-09-08T13:29:00Z" w:initials="AD">
     <w:p>
       <w:pPr>
         <w:pStyle w:val="CommentText"/>
@@ -3316,27 +3341,11 @@
         <w:annotationRef/>
       </w:r>
       <w:r>
-        <w:t>Add S if plural, remove if singular finding</w:t>
+        <w:t>No plural in this example</w:t>
       </w:r>
     </w:p>
   </w:comment>
-  <w:comment w:id="20" w:author="Anthony D'Alessandro" w:date="2025-09-08T13:29:00Z" w:initials="AD">
-    <w:p>
-      <w:pPr>
-        <w:pStyle w:val="CommentText"/>
-      </w:pPr>
-      <w:r>
-        <w:rPr>
-          <w:rStyle w:val="CommentReference"/>
-        </w:rPr>
-        <w:annotationRef/>
-      </w:r>
-      <w:r>
-        <w:t>No plural in this example</w:t>
-      </w:r>
-    </w:p>
-  </w:comment>
-  <w:comment w:id="21" w:author="Jones, Jasmine" w:date="2024-07-26T14:49:00Z" w:initials="JJ">
+  <w:comment w:id="20" w:author="Jones, Jasmine" w:date="2024-07-26T14:49:00Z" w:initials="JJ">
     <w:p>
       <w:pPr>
         <w:pStyle w:val="CommentText"/>
@@ -3431,7 +3440,7 @@
       </w:r>
     </w:p>
   </w:comment>
-  <w:comment w:id="22" w:author="Anthony D'Alessandro" w:date="2025-09-08T14:22:00Z" w:initials="AD">
+  <w:comment w:id="21" w:author="Anthony D'Alessandro" w:date="2025-09-08T14:22:00Z" w:initials="AD">
     <w:p>
       <w:pPr>
         <w:pStyle w:val="CommentText"/>
@@ -3447,7 +3456,7 @@
       </w:r>
     </w:p>
   </w:comment>
-  <w:comment w:id="23" w:author="Anthony D'Alessandro" w:date="2025-09-08T15:17:00Z" w:initials="AD">
+  <w:comment w:id="22" w:author="Anthony D'Alessandro" w:date="2025-09-08T15:17:00Z" w:initials="AD">
     <w:p>
       <w:pPr>
         <w:pStyle w:val="CommentText"/>
@@ -3463,7 +3472,7 @@
       </w:r>
     </w:p>
   </w:comment>
-  <w:comment w:id="25" w:author="Anthony D'Alessandro" w:date="2025-09-08T14:18:00Z" w:initials="AD">
+  <w:comment w:id="24" w:author="Anthony D'Alessandro" w:date="2025-09-08T14:18:00Z" w:initials="AD">
     <w:p>
       <w:pPr>
         <w:pStyle w:val="CommentText"/>
@@ -3479,7 +3488,7 @@
       </w:r>
     </w:p>
   </w:comment>
-  <w:comment w:id="28" w:author="Anthony D'Alessandro" w:date="2025-09-08T14:20:00Z" w:initials="AD">
+  <w:comment w:id="27" w:author="Anthony D'Alessandro" w:date="2025-09-08T14:20:00Z" w:initials="AD">
     <w:p>
       <w:pPr>
         <w:pStyle w:val="CommentText"/>
@@ -3521,7 +3530,6 @@
   <w15:commentEx w15:paraId="106C798F" w15:done="0"/>
   <w15:commentEx w15:paraId="39797E7D" w15:paraIdParent="106C798F" w15:done="0"/>
   <w15:commentEx w15:paraId="02B6DC6A" w15:paraIdParent="106C798F" w15:done="0"/>
-  <w15:commentEx w15:paraId="1E8E3193" w15:done="0"/>
   <w15:commentEx w15:paraId="0AA7958F" w15:done="0"/>
   <w15:commentEx w15:paraId="43DE5A9E" w15:done="0"/>
   <w15:commentEx w15:paraId="16C20D1E" w15:paraIdParent="43DE5A9E" w15:done="0"/>
@@ -3550,7 +3558,6 @@
   <w16cex:commentExtensible w16cex:durableId="70C9BCE0" w16cex:dateUtc="2025-09-08T15:12:00Z"/>
   <w16cex:commentExtensible w16cex:durableId="7048A7A0" w16cex:dateUtc="2025-09-08T15:17:00Z"/>
   <w16cex:commentExtensible w16cex:durableId="1696BE24" w16cex:dateUtc="2025-09-08T15:21:00Z"/>
-  <w16cex:commentExtensible w16cex:durableId="405864F6" w16cex:dateUtc="2025-09-08T15:19:00Z"/>
   <w16cex:commentExtensible w16cex:durableId="1BFAB22C" w16cex:dateUtc="2025-09-08T15:20:00Z"/>
   <w16cex:commentExtensible w16cex:durableId="3EC27938" w16cex:dateUtc="2025-09-08T15:30:00Z"/>
   <w16cex:commentExtensible w16cex:durableId="6A1394DD" w16cex:dateUtc="2025-09-08T17:29:00Z"/>
@@ -3579,7 +3586,6 @@
   <w16cid:commentId w16cid:paraId="106C798F" w16cid:durableId="70C9BCE0"/>
   <w16cid:commentId w16cid:paraId="39797E7D" w16cid:durableId="7048A7A0"/>
   <w16cid:commentId w16cid:paraId="02B6DC6A" w16cid:durableId="1696BE24"/>
-  <w16cid:commentId w16cid:paraId="1E8E3193" w16cid:durableId="405864F6"/>
   <w16cid:commentId w16cid:paraId="0AA7958F" w16cid:durableId="1BFAB22C"/>
   <w16cid:commentId w16cid:paraId="43DE5A9E" w16cid:durableId="3EC27938"/>
   <w16cid:commentId w16cid:paraId="16C20D1E" w16cid:durableId="6A1394DD"/>
@@ -3771,7 +3777,7 @@
           <v:imagedata r:id="rId1" o:title=""/>
           <w10:wrap anchorx="page" anchory="page"/>
         </v:shape>
-        <o:OLEObject Type="Embed" ProgID="Word.Picture.8" ShapeID="_x0000_s1026" DrawAspect="Content" ObjectID="_1829977278" r:id="rId2"/>
+        <o:OLEObject Type="Embed" ProgID="Word.Picture.8" ShapeID="_x0000_s1026" DrawAspect="Content" ObjectID="_1834034368" r:id="rId2"/>
       </w:object>
     </w:r>
     <w:r>

</xml_diff>